<commit_message>
Prevent internal review text from leaking into CV summaries
Repair the Neting and Beliven CV packages, refresh their match evidence, and enforce employer-facing Summary quality in prompts, validation, documentation, and tests. Include previously generated named CV exports already present in the checkout.
</commit_message>
<xml_diff>
--- a/registry/jobs/2026-09-23_070643_beliven_lead-software-engineer/application/CV_ValentinNikolaev_beliven_LEADSOFTWAREENGINEER.docx
+++ b/registry/jobs/2026-09-23_070643_beliven_lead-software-engineer/application/CV_ValentinNikolaev_beliven_LEADSOFTWAREENGINEER.docx
@@ -36,7 +36,7 @@
           <w:szCs w:val="24"/>
           <w:rtl w:val="false"/>
         </w:rPr>
-        <w:t xml:space="preserve">Lead Software Engineer | Backend Delivery and Technical Leadership</w:t>
+        <w:t xml:space="preserve">Lead Software Engineer | Backend and Technical Leadership</w:t>
       </w:r>
     </w:p>
     <w:p>
@@ -55,7 +55,7 @@
         </w:rPr>
         <w:t xml:space="preserve">Rome, Italy | </w:t>
       </w:r>
-      <w:hyperlink w:history="1" r:id="rId5t-sovhfv4lpvtryss1m2">
+      <w:hyperlink w:history="1" r:id="rIdgtfxyebp8i2-nfxntyoym">
         <w:r>
           <w:rPr>
             <w:rFonts w:ascii="Aptos" w:cs="Aptos" w:eastAsia="Aptos" w:hAnsi="Aptos"/>
@@ -76,9 +76,20 @@
           <w:szCs w:val="24"/>
           <w:rtl w:val="false"/>
         </w:rPr>
-        <w:t xml:space="preserve"> | +39 351 370 1194 | </w:t>
-      </w:r>
-      <w:hyperlink w:history="1" r:id="rId-jutye80zc4vnldz3mcz0">
+        <w:t xml:space="preserve"> | +39 351 370 1194</w:t>
+      </w:r>
+      <w:r>
+        <w:rPr>
+          <w:rFonts w:ascii="Aptos" w:cs="Aptos" w:eastAsia="Aptos" w:hAnsi="Aptos"/>
+          <w:color w:val="000000"/>
+          <w:sz w:val="24"/>
+          <w:szCs w:val="24"/>
+          <w:rtl w:val="false"/>
+        </w:rPr>
+        <w:t xml:space="preserve">
+</w:t>
+      </w:r>
+      <w:hyperlink w:history="1" r:id="rId98ry3mhevgzqba2etg4fe">
         <w:r>
           <w:rPr>
             <w:rFonts w:ascii="Aptos" w:cs="Aptos" w:eastAsia="Aptos" w:hAnsi="Aptos"/>
@@ -101,7 +112,7 @@
         </w:rPr>
         <w:t xml:space="preserve"> | </w:t>
       </w:r>
-      <w:hyperlink w:history="1" r:id="rIdk81lcqkr4n6vywtes82we">
+      <w:hyperlink w:history="1" r:id="rId9ikilnthydh9jwoxl-wes">
         <w:r>
           <w:rPr>
             <w:rFonts w:ascii="Aptos" w:cs="Aptos" w:eastAsia="Aptos" w:hAnsi="Aptos"/>
@@ -149,59 +160,7 @@
           <w:szCs w:val="24"/>
           <w:rtl w:val="false"/>
         </w:rPr>
-        <w:t xml:space="preserve">At Hyprr, I defined the technology roadmap with the CTO. [cv-hyprr]
-At PDFfiller, I led a backend engineering team. [email-team]</w:t>
-      </w:r>
-    </w:p>
-    <w:p>
-      <w:pPr>
-        <w:bidi w:val="false"/>
-        <w:spacing w:after="120" w:before="120" w:line="259.20000000000005"/>
-        <w:jc w:val="left"/>
-      </w:pPr>
-      <w:r>
-        <w:rPr>
-          <w:rFonts w:ascii="Aptos" w:cs="Aptos" w:eastAsia="Aptos" w:hAnsi="Aptos"/>
-          <w:color w:val="000000"/>
-          <w:sz w:val="24"/>
-          <w:szCs w:val="24"/>
-          <w:rtl w:val="false"/>
-        </w:rPr>
-        <w:t xml:space="preserve">Backend engineer positioned for hands-on technical leadership in PHP-oriented product teams. At Hyprr, I defined the technology roadmap with the CTO and helped establish the core stack for product delivery. [cv-hyprr] At PDFfiller, I led a team of 5 backend engineers developing a transactional email service. [email-team] My verified background includes PHP, Laravel, MySQL, REST APIs, production reliability, and CI/CD delivery; modern JavaScript and current frontend-framework experience are not claimed here.</w:t>
-      </w:r>
-    </w:p>
-    <w:p>
-      <w:pPr>
-        <w:bidi w:val="false"/>
-        <w:spacing w:after="120" w:before="120" w:line="259.20000000000005"/>
-        <w:jc w:val="left"/>
-      </w:pPr>
-      <w:r>
-        <w:rPr>
-          <w:rFonts w:ascii="Aptos" w:cs="Aptos" w:eastAsia="Aptos" w:hAnsi="Aptos"/>
-          <w:color w:val="000000"/>
-          <w:sz w:val="24"/>
-          <w:szCs w:val="24"/>
-          <w:rtl w:val="false"/>
-        </w:rPr>
-        <w:t xml:space="preserve">The role positioning draws on delivery evidence rather than a revised employment title. At Hyprr, I brought the product from prototype to closed beta in under 6 months. [cv-hyprr] At airSlate, I reduced peak load on the main database by removing bottlenecks and redistributing workload, improving service stability during high-traffic periods. [database-reliability] I also migrated services from ECS to Kubernetes and prepared the runtime stack for Kubernetes deployments with Helm, GitHub Actions, and ArgoCD. [kubernetes-migration] These examples support a backend lead profile with production-delivery context, while leaving the posting’s JavaScript, frontend-framework, SQL-depth, and two-project questions open for direct discussion.</w:t>
-      </w:r>
-    </w:p>
-    <w:p>
-      <w:pPr>
-        <w:bidi w:val="false"/>
-        <w:spacing w:after="120" w:before="120" w:line="259.20000000000005"/>
-        <w:jc w:val="left"/>
-      </w:pPr>
-      <w:r>
-        <w:rPr>
-          <w:rFonts w:ascii="Aptos" w:cs="Aptos" w:eastAsia="Aptos" w:hAnsi="Aptos"/>
-          <w:color w:val="000000"/>
-          <w:sz w:val="24"/>
-          <w:szCs w:val="24"/>
-          <w:rtl w:val="false"/>
-        </w:rPr>
-        <w:t xml:space="preserve">I work from clearly attributable outcomes: Simple.life support automation connected Zendesk, Intercom, and internal services. [support-platform] At PDFfiller, the transactional email service scaled to around 50 million emails per month. [email-scale] This CV keeps each achievement with its actual employer and role, contains no experience entry older than ten years, and avoids claiming technologies or responsibilities beyond the verified source excerpts.</w:t>
+        <w:t xml:space="preserve">Senior backend engineer and technical lead experienced in guiding teams, shaping architecture, and delivering production systems across PHP, Laravel, REST APIs, relational databases, AWS, and CI/CD. Experience includes defining a technology roadmap with a CTO, leading five backend engineers, and bringing a product from prototype to closed beta. Combines hands-on implementation with mentoring, stakeholder collaboration, production reliability, and pragmatic technical decisions from planning through production release and ongoing operations.</w:t>
       </w:r>
     </w:p>
     <w:p>
@@ -223,6 +182,97 @@
         <w:t xml:space="preserve">Skills</w:t>
       </w:r>
       <w:bookmarkEnd w:id="1"/>
+    </w:p>
+    <w:p>
+      <w:pPr>
+        <w:bidi w:val="false"/>
+        <w:spacing w:after="120" w:before="120" w:line="259.20000000000005"/>
+        <w:jc w:val="left"/>
+      </w:pPr>
+      <w:r>
+        <w:rPr>
+          <w:rFonts w:ascii="Aptos" w:cs="Aptos" w:eastAsia="Aptos" w:hAnsi="Aptos"/>
+          <w:color w:val="000000"/>
+          <w:sz w:val="24"/>
+          <w:szCs w:val="24"/>
+          <w:rtl w:val="false"/>
+        </w:rPr>
+        <w:t xml:space="preserve">PHP; Laravel; Symfony; Go; MySQL; PostgreSQL; SQL; REST APIs; Microservices; AWS; Kubernetes; CI/CD; GitHub Actions; ArgoCD; Helm; RabbitMQ</w:t>
+      </w:r>
+    </w:p>
+    <w:p>
+      <w:pPr>
+        <w:pStyle w:val="2"/>
+        <w:pStyle w:val="Heading2"/>
+        <w:bidi w:val="false"/>
+        <w:spacing w:after="120" w:before="240"/>
+      </w:pPr>
+      <w:bookmarkStart w:name="_Toc_Experience_4" w:id="1"/>
+      <w:r>
+        <w:rPr>
+          <w:rFonts w:ascii="Aptos" w:cs="Aptos" w:eastAsia="Aptos" w:hAnsi="Aptos"/>
+          <w:color w:val="000000"/>
+          <w:sz w:val="28"/>
+          <w:szCs w:val="28"/>
+          <w:rtl w:val="false"/>
+        </w:rPr>
+        <w:t xml:space="preserve">Experience</w:t>
+      </w:r>
+      <w:bookmarkEnd w:id="1"/>
+    </w:p>
+    <w:p>
+      <w:pPr>
+        <w:pStyle w:val="3"/>
+        <w:pStyle w:val="Heading3"/>
+        <w:bidi w:val="false"/>
+        <w:spacing w:after="120" w:before="240"/>
+      </w:pPr>
+      <w:bookmarkStart w:name="_Toc_Simplelife_Software_Developer_5" w:id="1"/>
+      <w:r>
+        <w:rPr>
+          <w:rFonts w:ascii="Aptos" w:cs="Aptos" w:eastAsia="Aptos" w:hAnsi="Aptos"/>
+          <w:color w:val="000000"/>
+          <w:sz w:val="24"/>
+          <w:szCs w:val="24"/>
+          <w:rtl w:val="false"/>
+        </w:rPr>
+        <w:t xml:space="preserve">Simple.life — Software Developer</w:t>
+      </w:r>
+      <w:bookmarkEnd w:id="1"/>
+    </w:p>
+    <w:p>
+      <w:pPr>
+        <w:bidi w:val="false"/>
+        <w:spacing w:after="120" w:before="120" w:line="259.20000000000005"/>
+        <w:jc w:val="left"/>
+      </w:pPr>
+      <w:r>
+        <w:rPr>
+          <w:rFonts w:ascii="Aptos" w:cs="Aptos" w:eastAsia="Aptos" w:hAnsi="Aptos"/>
+          <w:color w:val="000000"/>
+          <w:sz w:val="24"/>
+          <w:szCs w:val="24"/>
+          <w:rtl w:val="false"/>
+        </w:rPr>
+        <w:t xml:space="preserve">November 2023 – July 2026</w:t>
+      </w:r>
+    </w:p>
+    <w:p>
+      <w:pPr>
+        <w:bidi w:val="false"/>
+        <w:spacing w:after="120" w:before="120" w:line="259.20000000000005"/>
+        <w:jc w:val="left"/>
+      </w:pPr>
+      <w:r>
+        <w:rPr>
+          <w:rFonts w:ascii="Aptos" w:cs="Aptos" w:eastAsia="Aptos" w:hAnsi="Aptos"/>
+          <w:color w:val="000000"/>
+          <w:sz w:val="24"/>
+          <w:szCs w:val="24"/>
+          <w:rtl w:val="false"/>
+        </w:rPr>
+        <w:t xml:space="preserve">Digital health product company with production automation connecting customer-support tools and internal services.</w:t>
+      </w:r>
     </w:p>
     <w:p>
       <w:pPr>
@@ -242,7 +292,7 @@
           <w:szCs w:val="24"/>
           <w:rtl w:val="false"/>
         </w:rPr>
-        <w:t xml:space="preserve">PHP</w:t>
+        <w:t xml:space="preserve">Designed and owned a Go-based support automation platform connecting Zendesk, Intercom, and internal services.</w:t>
       </w:r>
     </w:p>
     <w:p>
@@ -263,7 +313,78 @@
           <w:szCs w:val="24"/>
           <w:rtl w:val="false"/>
         </w:rPr>
-        <w:t xml:space="preserve">Go</w:t>
+        <w:t xml:space="preserve">Integrated OpenAI-powered auto-triage flows that automated or deflected up to 30% of inbound tickets.</w:t>
+      </w:r>
+    </w:p>
+    <w:p>
+      <w:pPr>
+        <w:bidi w:val="false"/>
+        <w:spacing w:after="120" w:before="120" w:line="259.20000000000005"/>
+        <w:jc w:val="left"/>
+      </w:pPr>
+      <w:r>
+        <w:rPr>
+          <w:rFonts w:ascii="Aptos" w:cs="Aptos" w:eastAsia="Aptos" w:hAnsi="Aptos"/>
+          <w:color w:val="000000"/>
+          <w:sz w:val="24"/>
+          <w:szCs w:val="24"/>
+          <w:rtl w:val="false"/>
+        </w:rPr>
+        <w:t xml:space="preserve">Technologies: Go, OpenAI APIs, Zendesk, Intercom</w:t>
+      </w:r>
+    </w:p>
+    <w:p>
+      <w:pPr>
+        <w:pStyle w:val="3"/>
+        <w:pStyle w:val="Heading3"/>
+        <w:bidi w:val="false"/>
+        <w:spacing w:after="120" w:before="240"/>
+      </w:pPr>
+      <w:bookmarkStart w:name="_Toc_airSlate_Software_Developer_6" w:id="1"/>
+      <w:r>
+        <w:rPr>
+          <w:rFonts w:ascii="Aptos" w:cs="Aptos" w:eastAsia="Aptos" w:hAnsi="Aptos"/>
+          <w:color w:val="000000"/>
+          <w:sz w:val="24"/>
+          <w:szCs w:val="24"/>
+          <w:rtl w:val="false"/>
+        </w:rPr>
+        <w:t xml:space="preserve">airSlate — Software Developer</w:t>
+      </w:r>
+      <w:bookmarkEnd w:id="1"/>
+    </w:p>
+    <w:p>
+      <w:pPr>
+        <w:bidi w:val="false"/>
+        <w:spacing w:after="120" w:before="120" w:line="259.20000000000005"/>
+        <w:jc w:val="left"/>
+      </w:pPr>
+      <w:r>
+        <w:rPr>
+          <w:rFonts w:ascii="Aptos" w:cs="Aptos" w:eastAsia="Aptos" w:hAnsi="Aptos"/>
+          <w:color w:val="000000"/>
+          <w:sz w:val="24"/>
+          <w:szCs w:val="24"/>
+          <w:rtl w:val="false"/>
+        </w:rPr>
+        <w:t xml:space="preserve">February 2021 – August 2023</w:t>
+      </w:r>
+    </w:p>
+    <w:p>
+      <w:pPr>
+        <w:bidi w:val="false"/>
+        <w:spacing w:after="120" w:before="120" w:line="259.20000000000005"/>
+        <w:jc w:val="left"/>
+      </w:pPr>
+      <w:r>
+        <w:rPr>
+          <w:rFonts w:ascii="Aptos" w:cs="Aptos" w:eastAsia="Aptos" w:hAnsi="Aptos"/>
+          <w:color w:val="000000"/>
+          <w:sz w:val="24"/>
+          <w:szCs w:val="24"/>
+          <w:rtl w:val="false"/>
+        </w:rPr>
+        <w:t xml:space="preserve">Global SaaS platform for document automation, workflow management, and electronic signatures.</w:t>
       </w:r>
     </w:p>
     <w:p>
@@ -284,7 +405,7 @@
           <w:szCs w:val="24"/>
           <w:rtl w:val="false"/>
         </w:rPr>
-        <w:t xml:space="preserve">Laravel</w:t>
+        <w:t xml:space="preserve">Reduced peak load on the main database by removing bottlenecks and redistributing workload, improving service stability during high-traffic periods.</w:t>
       </w:r>
     </w:p>
     <w:p>
@@ -305,7 +426,78 @@
           <w:szCs w:val="24"/>
           <w:rtl w:val="false"/>
         </w:rPr>
-        <w:t xml:space="preserve">Symfony</w:t>
+        <w:t xml:space="preserve">Migrated services from ECS to Kubernetes and prepared the deployment stack with Helm, GitHub Actions, and ArgoCD.</w:t>
+      </w:r>
+    </w:p>
+    <w:p>
+      <w:pPr>
+        <w:bidi w:val="false"/>
+        <w:spacing w:after="120" w:before="120" w:line="259.20000000000005"/>
+        <w:jc w:val="left"/>
+      </w:pPr>
+      <w:r>
+        <w:rPr>
+          <w:rFonts w:ascii="Aptos" w:cs="Aptos" w:eastAsia="Aptos" w:hAnsi="Aptos"/>
+          <w:color w:val="000000"/>
+          <w:sz w:val="24"/>
+          <w:szCs w:val="24"/>
+          <w:rtl w:val="false"/>
+        </w:rPr>
+        <w:t xml:space="preserve">Technologies: PHP, Laravel, MySQL, AWS, ECS, Kubernetes, Helm, GitHub Actions, ArgoCD</w:t>
+      </w:r>
+    </w:p>
+    <w:p>
+      <w:pPr>
+        <w:pStyle w:val="3"/>
+        <w:pStyle w:val="Heading3"/>
+        <w:bidi w:val="false"/>
+        <w:spacing w:after="120" w:before="240"/>
+      </w:pPr>
+      <w:bookmarkStart w:name="_Toc_Hyprr_Technical_Lead_7" w:id="1"/>
+      <w:r>
+        <w:rPr>
+          <w:rFonts w:ascii="Aptos" w:cs="Aptos" w:eastAsia="Aptos" w:hAnsi="Aptos"/>
+          <w:color w:val="000000"/>
+          <w:sz w:val="24"/>
+          <w:szCs w:val="24"/>
+          <w:rtl w:val="false"/>
+        </w:rPr>
+        <w:t xml:space="preserve">Hyprr — Technical Lead</w:t>
+      </w:r>
+      <w:bookmarkEnd w:id="1"/>
+    </w:p>
+    <w:p>
+      <w:pPr>
+        <w:bidi w:val="false"/>
+        <w:spacing w:after="120" w:before="120" w:line="259.20000000000005"/>
+        <w:jc w:val="left"/>
+      </w:pPr>
+      <w:r>
+        <w:rPr>
+          <w:rFonts w:ascii="Aptos" w:cs="Aptos" w:eastAsia="Aptos" w:hAnsi="Aptos"/>
+          <w:color w:val="000000"/>
+          <w:sz w:val="24"/>
+          <w:szCs w:val="24"/>
+          <w:rtl w:val="false"/>
+        </w:rPr>
+        <w:t xml:space="preserve">November 2019 – January 2021</w:t>
+      </w:r>
+    </w:p>
+    <w:p>
+      <w:pPr>
+        <w:bidi w:val="false"/>
+        <w:spacing w:after="120" w:before="120" w:line="259.20000000000005"/>
+        <w:jc w:val="left"/>
+      </w:pPr>
+      <w:r>
+        <w:rPr>
+          <w:rFonts w:ascii="Aptos" w:cs="Aptos" w:eastAsia="Aptos" w:hAnsi="Aptos"/>
+          <w:color w:val="000000"/>
+          <w:sz w:val="24"/>
+          <w:szCs w:val="24"/>
+          <w:rtl w:val="false"/>
+        </w:rPr>
+        <w:t xml:space="preserve">Creator-focused digital platform developed from an early prototype into a closed beta product.</w:t>
       </w:r>
     </w:p>
     <w:p>
@@ -326,7 +518,7 @@
           <w:szCs w:val="24"/>
           <w:rtl w:val="false"/>
         </w:rPr>
-        <w:t xml:space="preserve">MySQL</w:t>
+        <w:t xml:space="preserve">Brought the product from prototype to closed beta in under six months.</w:t>
       </w:r>
     </w:p>
     <w:p>
@@ -347,7 +539,7 @@
           <w:szCs w:val="24"/>
           <w:rtl w:val="false"/>
         </w:rPr>
-        <w:t xml:space="preserve">PostgreSQL</w:t>
+        <w:t xml:space="preserve">Defined the technology roadmap with the CTO and helped establish the core stack for product delivery.</w:t>
       </w:r>
     </w:p>
     <w:p>
@@ -368,7 +560,7 @@
           <w:szCs w:val="24"/>
           <w:rtl w:val="false"/>
         </w:rPr>
-        <w:t xml:space="preserve">REST APIs</w:t>
+        <w:t xml:space="preserve">Influenced product development across project planning, microservice and serverless architecture, CI/CD, and reliability concerns.</w:t>
       </w:r>
     </w:p>
     <w:p>
@@ -389,7 +581,78 @@
           <w:szCs w:val="24"/>
           <w:rtl w:val="false"/>
         </w:rPr>
-        <w:t xml:space="preserve">Microservices</w:t>
+        <w:t xml:space="preserve">Led backend development and contributed to the platform’s Ethereum-based digital asset components.</w:t>
+      </w:r>
+    </w:p>
+    <w:p>
+      <w:pPr>
+        <w:bidi w:val="false"/>
+        <w:spacing w:after="120" w:before="120" w:line="259.20000000000005"/>
+        <w:jc w:val="left"/>
+      </w:pPr>
+      <w:r>
+        <w:rPr>
+          <w:rFonts w:ascii="Aptos" w:cs="Aptos" w:eastAsia="Aptos" w:hAnsi="Aptos"/>
+          <w:color w:val="000000"/>
+          <w:sz w:val="24"/>
+          <w:szCs w:val="24"/>
+          <w:rtl w:val="false"/>
+        </w:rPr>
+        <w:t xml:space="preserve">Technologies: PHP, Go, Laravel, MySQL, AWS, Kubernetes, Microservices, REST APIs, CI/CD</w:t>
+      </w:r>
+    </w:p>
+    <w:p>
+      <w:pPr>
+        <w:pStyle w:val="3"/>
+        <w:pStyle w:val="Heading3"/>
+        <w:bidi w:val="false"/>
+        <w:spacing w:after="120" w:before="240"/>
+      </w:pPr>
+      <w:bookmarkStart w:name="_Toc_PDFfiller_Software_Developer_8" w:id="1"/>
+      <w:r>
+        <w:rPr>
+          <w:rFonts w:ascii="Aptos" w:cs="Aptos" w:eastAsia="Aptos" w:hAnsi="Aptos"/>
+          <w:color w:val="000000"/>
+          <w:sz w:val="24"/>
+          <w:szCs w:val="24"/>
+          <w:rtl w:val="false"/>
+        </w:rPr>
+        <w:t xml:space="preserve">PDFfiller — Software Developer</w:t>
+      </w:r>
+      <w:bookmarkEnd w:id="1"/>
+    </w:p>
+    <w:p>
+      <w:pPr>
+        <w:bidi w:val="false"/>
+        <w:spacing w:after="120" w:before="120" w:line="259.20000000000005"/>
+        <w:jc w:val="left"/>
+      </w:pPr>
+      <w:r>
+        <w:rPr>
+          <w:rFonts w:ascii="Aptos" w:cs="Aptos" w:eastAsia="Aptos" w:hAnsi="Aptos"/>
+          <w:color w:val="000000"/>
+          <w:sz w:val="24"/>
+          <w:szCs w:val="24"/>
+          <w:rtl w:val="false"/>
+        </w:rPr>
+        <w:t xml:space="preserve">October 2016 – November 2019</w:t>
+      </w:r>
+    </w:p>
+    <w:p>
+      <w:pPr>
+        <w:bidi w:val="false"/>
+        <w:spacing w:after="120" w:before="120" w:line="259.20000000000005"/>
+        <w:jc w:val="left"/>
+      </w:pPr>
+      <w:r>
+        <w:rPr>
+          <w:rFonts w:ascii="Aptos" w:cs="Aptos" w:eastAsia="Aptos" w:hAnsi="Aptos"/>
+          <w:color w:val="000000"/>
+          <w:sz w:val="24"/>
+          <w:szCs w:val="24"/>
+          <w:rtl w:val="false"/>
+        </w:rPr>
+        <w:t xml:space="preserve">Document-management SaaS product with a high-volume transactional email platform serving production communication workflows.</w:t>
       </w:r>
     </w:p>
     <w:p>
@@ -410,7 +673,7 @@
           <w:szCs w:val="24"/>
           <w:rtl w:val="false"/>
         </w:rPr>
-        <w:t xml:space="preserve">AWS</w:t>
+        <w:t xml:space="preserve">Led a team of five backend engineers developing a transactional email service.</w:t>
       </w:r>
     </w:p>
     <w:p>
@@ -431,133 +694,24 @@
           <w:szCs w:val="24"/>
           <w:rtl w:val="false"/>
         </w:rPr>
-        <w:t xml:space="preserve">Kubernetes</w:t>
-      </w:r>
-    </w:p>
-    <w:p>
-      <w:pPr>
-        <w:pStyle w:val="ListParagraph"/>
-        <w:numPr>
-          <w:ilvl w:val="0"/>
-          <w:numId w:val="1"/>
-        </w:numPr>
-        <w:bidi w:val="false"/>
-        <w:spacing w:after="60" w:before="60"/>
-      </w:pPr>
-      <w:r>
-        <w:rPr>
-          <w:rFonts w:ascii="Aptos" w:cs="Aptos" w:eastAsia="Aptos" w:hAnsi="Aptos"/>
-          <w:color w:val="000000"/>
-          <w:sz w:val="24"/>
-          <w:szCs w:val="24"/>
-          <w:rtl w:val="false"/>
-        </w:rPr>
-        <w:t xml:space="preserve">GitHub Actions</w:t>
-      </w:r>
-    </w:p>
-    <w:p>
-      <w:pPr>
-        <w:pStyle w:val="ListParagraph"/>
-        <w:numPr>
-          <w:ilvl w:val="0"/>
-          <w:numId w:val="1"/>
-        </w:numPr>
-        <w:bidi w:val="false"/>
-        <w:spacing w:after="60" w:before="60"/>
-      </w:pPr>
-      <w:r>
-        <w:rPr>
-          <w:rFonts w:ascii="Aptos" w:cs="Aptos" w:eastAsia="Aptos" w:hAnsi="Aptos"/>
-          <w:color w:val="000000"/>
-          <w:sz w:val="24"/>
-          <w:szCs w:val="24"/>
-          <w:rtl w:val="false"/>
-        </w:rPr>
-        <w:t xml:space="preserve">ArgoCD</w:t>
-      </w:r>
-    </w:p>
-    <w:p>
-      <w:pPr>
-        <w:pStyle w:val="ListParagraph"/>
-        <w:numPr>
-          <w:ilvl w:val="0"/>
-          <w:numId w:val="1"/>
-        </w:numPr>
-        <w:bidi w:val="false"/>
-        <w:spacing w:after="60" w:before="60"/>
-      </w:pPr>
-      <w:r>
-        <w:rPr>
-          <w:rFonts w:ascii="Aptos" w:cs="Aptos" w:eastAsia="Aptos" w:hAnsi="Aptos"/>
-          <w:color w:val="000000"/>
-          <w:sz w:val="24"/>
-          <w:szCs w:val="24"/>
-          <w:rtl w:val="false"/>
-        </w:rPr>
-        <w:t xml:space="preserve">Helm</w:t>
-      </w:r>
-    </w:p>
-    <w:p>
-      <w:pPr>
-        <w:pStyle w:val="ListParagraph"/>
-        <w:numPr>
-          <w:ilvl w:val="0"/>
-          <w:numId w:val="1"/>
-        </w:numPr>
-        <w:bidi w:val="false"/>
-        <w:spacing w:after="60" w:before="60"/>
-      </w:pPr>
-      <w:r>
-        <w:rPr>
-          <w:rFonts w:ascii="Aptos" w:cs="Aptos" w:eastAsia="Aptos" w:hAnsi="Aptos"/>
-          <w:color w:val="000000"/>
-          <w:sz w:val="24"/>
-          <w:szCs w:val="24"/>
-          <w:rtl w:val="false"/>
-        </w:rPr>
-        <w:t xml:space="preserve">RabbitMQ</w:t>
-      </w:r>
-    </w:p>
-    <w:p>
-      <w:pPr>
-        <w:pStyle w:val="ListParagraph"/>
-        <w:numPr>
-          <w:ilvl w:val="0"/>
-          <w:numId w:val="1"/>
-        </w:numPr>
-        <w:bidi w:val="false"/>
-        <w:spacing w:after="60" w:before="60"/>
-      </w:pPr>
-      <w:r>
-        <w:rPr>
-          <w:rFonts w:ascii="Aptos" w:cs="Aptos" w:eastAsia="Aptos" w:hAnsi="Aptos"/>
-          <w:color w:val="000000"/>
-          <w:sz w:val="24"/>
-          <w:szCs w:val="24"/>
-          <w:rtl w:val="false"/>
-        </w:rPr>
-        <w:t xml:space="preserve">Prometheus</w:t>
-      </w:r>
-    </w:p>
-    <w:p>
-      <w:pPr>
-        <w:pStyle w:val="ListParagraph"/>
-        <w:numPr>
-          <w:ilvl w:val="0"/>
-          <w:numId w:val="1"/>
-        </w:numPr>
-        <w:bidi w:val="false"/>
-        <w:spacing w:after="60" w:before="60"/>
-      </w:pPr>
-      <w:r>
-        <w:rPr>
-          <w:rFonts w:ascii="Aptos" w:cs="Aptos" w:eastAsia="Aptos" w:hAnsi="Aptos"/>
-          <w:color w:val="000000"/>
-          <w:sz w:val="24"/>
-          <w:szCs w:val="24"/>
-          <w:rtl w:val="false"/>
-        </w:rPr>
-        <w:t xml:space="preserve">System design</w:t>
+        <w:t xml:space="preserve">Scaled the service to approximately 50 million emails per month while supporting production delivery at high volume.</w:t>
+      </w:r>
+    </w:p>
+    <w:p>
+      <w:pPr>
+        <w:bidi w:val="false"/>
+        <w:spacing w:after="120" w:before="120" w:line="259.20000000000005"/>
+        <w:jc w:val="left"/>
+      </w:pPr>
+      <w:r>
+        <w:rPr>
+          <w:rFonts w:ascii="Aptos" w:cs="Aptos" w:eastAsia="Aptos" w:hAnsi="Aptos"/>
+          <w:color w:val="000000"/>
+          <w:sz w:val="24"/>
+          <w:szCs w:val="24"/>
+          <w:rtl w:val="false"/>
+        </w:rPr>
+        <w:t xml:space="preserve">Technologies: PHP, Laravel, MySQL, Transactional email systems</w:t>
       </w:r>
     </w:p>
     <w:p>
@@ -567,7 +721,7 @@
         <w:bidi w:val="false"/>
         <w:spacing w:after="120" w:before="240"/>
       </w:pPr>
-      <w:bookmarkStart w:name="_Toc_Experience_4" w:id="1"/>
+      <w:bookmarkStart w:name="_Toc_Education_9" w:id="1"/>
       <w:r>
         <w:rPr>
           <w:rFonts w:ascii="Aptos" w:cs="Aptos" w:eastAsia="Aptos" w:hAnsi="Aptos"/>
@@ -576,386 +730,25 @@
           <w:szCs w:val="28"/>
           <w:rtl w:val="false"/>
         </w:rPr>
-        <w:t xml:space="preserve">Experience</w:t>
+        <w:t xml:space="preserve">Education</w:t>
       </w:r>
       <w:bookmarkEnd w:id="1"/>
     </w:p>
     <w:p>
       <w:pPr>
-        <w:pStyle w:val="3"/>
-        <w:pStyle w:val="Heading3"/>
-        <w:bidi w:val="false"/>
-        <w:spacing w:after="120" w:before="240"/>
-      </w:pPr>
-      <w:bookmarkStart w:name="_Toc_Simplelife_Software_Developer_November_2_5" w:id="1"/>
-      <w:r>
-        <w:rPr>
-          <w:rFonts w:ascii="Aptos" w:cs="Aptos" w:eastAsia="Aptos" w:hAnsi="Aptos"/>
-          <w:color w:val="000000"/>
-          <w:sz w:val="24"/>
-          <w:szCs w:val="24"/>
-          <w:rtl w:val="false"/>
-        </w:rPr>
-        <w:t xml:space="preserve">Simple.life — Software Developer | November 2023 – July 2026</w:t>
-      </w:r>
-      <w:bookmarkEnd w:id="1"/>
-    </w:p>
-    <w:p>
-      <w:pPr>
-        <w:pStyle w:val="ListParagraph"/>
-        <w:numPr>
-          <w:ilvl w:val="0"/>
-          <w:numId w:val="1"/>
-        </w:numPr>
-        <w:bidi w:val="false"/>
-        <w:spacing w:after="60" w:before="60"/>
-      </w:pPr>
-      <w:r>
-        <w:rPr>
-          <w:rFonts w:ascii="Aptos" w:cs="Aptos" w:eastAsia="Aptos" w:hAnsi="Aptos"/>
-          <w:color w:val="000000"/>
-          <w:sz w:val="24"/>
-          <w:szCs w:val="24"/>
-          <w:rtl w:val="false"/>
-        </w:rPr>
-        <w:t xml:space="preserve">Designed and owned a Go-based support automation platform connecting Zendesk, Intercom, and internal services. [support-platform]</w:t>
-      </w:r>
-    </w:p>
-    <w:p>
-      <w:pPr>
-        <w:pStyle w:val="ListParagraph"/>
-        <w:numPr>
-          <w:ilvl w:val="0"/>
-          <w:numId w:val="1"/>
-        </w:numPr>
-        <w:bidi w:val="false"/>
-        <w:spacing w:after="60" w:before="60"/>
-      </w:pPr>
-      <w:r>
-        <w:rPr>
-          <w:rFonts w:ascii="Aptos" w:cs="Aptos" w:eastAsia="Aptos" w:hAnsi="Aptos"/>
-          <w:color w:val="000000"/>
-          <w:sz w:val="24"/>
-          <w:szCs w:val="24"/>
-          <w:rtl w:val="false"/>
-        </w:rPr>
-        <w:t xml:space="preserve">Integrated OpenAI-powered auto-triage flows, automating or deflecting up to 30% of inbound tickets. [support-triage]</w:t>
-      </w:r>
-    </w:p>
-    <w:p>
-      <w:pPr>
-        <w:pStyle w:val="ListParagraph"/>
-        <w:numPr>
-          <w:ilvl w:val="0"/>
-          <w:numId w:val="1"/>
-        </w:numPr>
-        <w:bidi w:val="false"/>
-        <w:spacing w:after="60" w:before="60"/>
-      </w:pPr>
-      <w:r>
-        <w:rPr>
-          <w:rFonts w:ascii="Aptos" w:cs="Aptos" w:eastAsia="Aptos" w:hAnsi="Aptos"/>
-          <w:color w:val="000000"/>
-          <w:sz w:val="24"/>
-          <w:szCs w:val="24"/>
-          <w:rtl w:val="false"/>
-        </w:rPr>
-        <w:t xml:space="preserve">Built a support automation platform around external support tools and internal services. [support-platform]</w:t>
-      </w:r>
-    </w:p>
-    <w:p>
-      <w:pPr>
-        <w:pStyle w:val="ListParagraph"/>
-        <w:numPr>
-          <w:ilvl w:val="0"/>
-          <w:numId w:val="1"/>
-        </w:numPr>
-        <w:bidi w:val="false"/>
-        <w:spacing w:after="60" w:before="60"/>
-      </w:pPr>
-      <w:r>
-        <w:rPr>
-          <w:rFonts w:ascii="Aptos" w:cs="Aptos" w:eastAsia="Aptos" w:hAnsi="Aptos"/>
-          <w:color w:val="000000"/>
-          <w:sz w:val="24"/>
-          <w:szCs w:val="24"/>
-          <w:rtl w:val="false"/>
-        </w:rPr>
-        <w:t xml:space="preserve">Automated or deflected up to 30% of inbound tickets through auto-triage flows. [support-triage]
-Technologies: Go, Zendesk, Intercom</w:t>
-      </w:r>
-    </w:p>
-    <w:p>
-      <w:pPr>
-        <w:pStyle w:val="3"/>
-        <w:pStyle w:val="Heading3"/>
-        <w:bidi w:val="false"/>
-        <w:spacing w:after="120" w:before="240"/>
-      </w:pPr>
-      <w:bookmarkStart w:name="_Toc_airSlate_Software_Developer_February_202_6" w:id="1"/>
-      <w:r>
-        <w:rPr>
-          <w:rFonts w:ascii="Aptos" w:cs="Aptos" w:eastAsia="Aptos" w:hAnsi="Aptos"/>
-          <w:color w:val="000000"/>
-          <w:sz w:val="24"/>
-          <w:szCs w:val="24"/>
-          <w:rtl w:val="false"/>
-        </w:rPr>
-        <w:t xml:space="preserve">airSlate — Software Developer | February 2021 – August 2023</w:t>
-      </w:r>
-      <w:bookmarkEnd w:id="1"/>
-    </w:p>
-    <w:p>
-      <w:pPr>
-        <w:pStyle w:val="ListParagraph"/>
-        <w:numPr>
-          <w:ilvl w:val="0"/>
-          <w:numId w:val="1"/>
-        </w:numPr>
-        <w:bidi w:val="false"/>
-        <w:spacing w:after="60" w:before="60"/>
-      </w:pPr>
-      <w:r>
-        <w:rPr>
-          <w:rFonts w:ascii="Aptos" w:cs="Aptos" w:eastAsia="Aptos" w:hAnsi="Aptos"/>
-          <w:color w:val="000000"/>
-          <w:sz w:val="24"/>
-          <w:szCs w:val="24"/>
-          <w:rtl w:val="false"/>
-        </w:rPr>
-        <w:t xml:space="preserve">Reduced peak load on the main database by removing bottlenecks and redistributing workload, improving service stability during high-traffic periods. [database-reliability]</w:t>
-      </w:r>
-    </w:p>
-    <w:p>
-      <w:pPr>
-        <w:pStyle w:val="ListParagraph"/>
-        <w:numPr>
-          <w:ilvl w:val="0"/>
-          <w:numId w:val="1"/>
-        </w:numPr>
-        <w:bidi w:val="false"/>
-        <w:spacing w:after="60" w:before="60"/>
-      </w:pPr>
-      <w:r>
-        <w:rPr>
-          <w:rFonts w:ascii="Aptos" w:cs="Aptos" w:eastAsia="Aptos" w:hAnsi="Aptos"/>
-          <w:color w:val="000000"/>
-          <w:sz w:val="24"/>
-          <w:szCs w:val="24"/>
-          <w:rtl w:val="false"/>
-        </w:rPr>
-        <w:t xml:space="preserve">Migrated services from ECS to Kubernetes and prepared the runtime stack for Kubernetes deployments with Helm, GitHub Actions, and ArgoCD. [kubernetes-migration]</w:t>
-      </w:r>
-    </w:p>
-    <w:p>
-      <w:pPr>
-        <w:pStyle w:val="ListParagraph"/>
-        <w:numPr>
-          <w:ilvl w:val="0"/>
-          <w:numId w:val="1"/>
-        </w:numPr>
-        <w:bidi w:val="false"/>
-        <w:spacing w:after="60" w:before="60"/>
-      </w:pPr>
-      <w:r>
-        <w:rPr>
-          <w:rFonts w:ascii="Aptos" w:cs="Aptos" w:eastAsia="Aptos" w:hAnsi="Aptos"/>
-          <w:color w:val="000000"/>
-          <w:sz w:val="24"/>
-          <w:szCs w:val="24"/>
-          <w:rtl w:val="false"/>
-        </w:rPr>
-        <w:t xml:space="preserve">Improved service stability during high-traffic periods by removing database bottlenecks and redistributing workload. [database-reliability]</w:t>
-      </w:r>
-    </w:p>
-    <w:p>
-      <w:pPr>
-        <w:pStyle w:val="ListParagraph"/>
-        <w:numPr>
-          <w:ilvl w:val="0"/>
-          <w:numId w:val="1"/>
-        </w:numPr>
-        <w:bidi w:val="false"/>
-        <w:spacing w:after="60" w:before="60"/>
-      </w:pPr>
-      <w:r>
-        <w:rPr>
-          <w:rFonts w:ascii="Aptos" w:cs="Aptos" w:eastAsia="Aptos" w:hAnsi="Aptos"/>
-          <w:color w:val="000000"/>
-          <w:sz w:val="24"/>
-          <w:szCs w:val="24"/>
-          <w:rtl w:val="false"/>
-        </w:rPr>
-        <w:t xml:space="preserve">Prepared the runtime stack for Kubernetes deployments with Helm, GitHub Actions, and ArgoCD. [kubernetes-migration]
-Technologies: Kubernetes, Helm, GitHub Actions, ArgoCD</w:t>
-      </w:r>
-    </w:p>
-    <w:p>
-      <w:pPr>
-        <w:pStyle w:val="3"/>
-        <w:pStyle w:val="Heading3"/>
-        <w:bidi w:val="false"/>
-        <w:spacing w:after="120" w:before="240"/>
-      </w:pPr>
-      <w:bookmarkStart w:name="_Toc_Hyprr_Technical_Lead_November_2019_Janua_7" w:id="1"/>
-      <w:r>
-        <w:rPr>
-          <w:rFonts w:ascii="Aptos" w:cs="Aptos" w:eastAsia="Aptos" w:hAnsi="Aptos"/>
-          <w:color w:val="000000"/>
-          <w:sz w:val="24"/>
-          <w:szCs w:val="24"/>
-          <w:rtl w:val="false"/>
-        </w:rPr>
-        <w:t xml:space="preserve">Hyprr — Technical Lead | November 2019 – January 2021</w:t>
-      </w:r>
-      <w:bookmarkEnd w:id="1"/>
-    </w:p>
-    <w:p>
-      <w:pPr>
-        <w:pStyle w:val="ListParagraph"/>
-        <w:numPr>
-          <w:ilvl w:val="0"/>
-          <w:numId w:val="1"/>
-        </w:numPr>
-        <w:bidi w:val="false"/>
-        <w:spacing w:after="60" w:before="60"/>
-      </w:pPr>
-      <w:r>
-        <w:rPr>
-          <w:rFonts w:ascii="Aptos" w:cs="Aptos" w:eastAsia="Aptos" w:hAnsi="Aptos"/>
-          <w:color w:val="000000"/>
-          <w:sz w:val="24"/>
-          <w:szCs w:val="24"/>
-          <w:rtl w:val="false"/>
-        </w:rPr>
-        <w:t xml:space="preserve">Brought the product from prototype to closed beta in under 6 months. [cv-hyprr]</w:t>
-      </w:r>
-    </w:p>
-    <w:p>
-      <w:pPr>
-        <w:pStyle w:val="ListParagraph"/>
-        <w:numPr>
-          <w:ilvl w:val="0"/>
-          <w:numId w:val="1"/>
-        </w:numPr>
-        <w:bidi w:val="false"/>
-        <w:spacing w:after="60" w:before="60"/>
-      </w:pPr>
-      <w:r>
-        <w:rPr>
-          <w:rFonts w:ascii="Aptos" w:cs="Aptos" w:eastAsia="Aptos" w:hAnsi="Aptos"/>
-          <w:color w:val="000000"/>
-          <w:sz w:val="24"/>
-          <w:szCs w:val="24"/>
-          <w:rtl w:val="false"/>
-        </w:rPr>
-        <w:t xml:space="preserve">Defined the technology roadmap with the CTO and helped establish the core stack for product delivery. [cv-hyprr]</w:t>
-      </w:r>
-    </w:p>
-    <w:p>
-      <w:pPr>
-        <w:pStyle w:val="ListParagraph"/>
-        <w:numPr>
-          <w:ilvl w:val="0"/>
-          <w:numId w:val="1"/>
-        </w:numPr>
-        <w:bidi w:val="false"/>
-        <w:spacing w:after="60" w:before="60"/>
-      </w:pPr>
-      <w:r>
-        <w:rPr>
-          <w:rFonts w:ascii="Aptos" w:cs="Aptos" w:eastAsia="Aptos" w:hAnsi="Aptos"/>
-          <w:color w:val="000000"/>
-          <w:sz w:val="24"/>
-          <w:szCs w:val="24"/>
-          <w:rtl w:val="false"/>
-        </w:rPr>
-        <w:t xml:space="preserve">Influenced product development across project planning, microservice and serverless architecture, CI/CD, and reliability/serviceability concerns. [cv-hyprr]</w:t>
-      </w:r>
-    </w:p>
-    <w:p>
-      <w:pPr>
-        <w:pStyle w:val="ListParagraph"/>
-        <w:numPr>
-          <w:ilvl w:val="0"/>
-          <w:numId w:val="1"/>
-        </w:numPr>
-        <w:bidi w:val="false"/>
-        <w:spacing w:after="60" w:before="60"/>
-      </w:pPr>
-      <w:r>
-        <w:rPr>
-          <w:rFonts w:ascii="Aptos" w:cs="Aptos" w:eastAsia="Aptos" w:hAnsi="Aptos"/>
-          <w:color w:val="000000"/>
-          <w:sz w:val="24"/>
-          <w:szCs w:val="24"/>
-          <w:rtl w:val="false"/>
-        </w:rPr>
-        <w:t xml:space="preserve">Led backend development and worked on the platform's Ethereum-based digital asset components. [cv-hyprr]
-Technologies: PHP, Go, Laravel, MySQL, AWS, Kubernetes, Microservices, REST APIs, CI/CD</w:t>
-      </w:r>
-    </w:p>
-    <w:p>
-      <w:pPr>
-        <w:pStyle w:val="3"/>
-        <w:pStyle w:val="Heading3"/>
-        <w:bidi w:val="false"/>
-        <w:spacing w:after="120" w:before="240"/>
-      </w:pPr>
-      <w:bookmarkStart w:name="_Toc_PDFfiller_Software_Developer_October_201_8" w:id="1"/>
-      <w:r>
-        <w:rPr>
-          <w:rFonts w:ascii="Aptos" w:cs="Aptos" w:eastAsia="Aptos" w:hAnsi="Aptos"/>
-          <w:color w:val="000000"/>
-          <w:sz w:val="24"/>
-          <w:szCs w:val="24"/>
-          <w:rtl w:val="false"/>
-        </w:rPr>
-        <w:t xml:space="preserve">PDFfiller — Software Developer | October 2016 – November 2019</w:t>
-      </w:r>
-      <w:bookmarkEnd w:id="1"/>
-    </w:p>
-    <w:p>
-      <w:pPr>
-        <w:pStyle w:val="ListParagraph"/>
-        <w:numPr>
-          <w:ilvl w:val="0"/>
-          <w:numId w:val="1"/>
-        </w:numPr>
-        <w:bidi w:val="false"/>
-        <w:spacing w:after="60" w:before="60"/>
-      </w:pPr>
-      <w:r>
-        <w:rPr>
-          <w:rFonts w:ascii="Aptos" w:cs="Aptos" w:eastAsia="Aptos" w:hAnsi="Aptos"/>
-          <w:color w:val="000000"/>
-          <w:sz w:val="24"/>
-          <w:szCs w:val="24"/>
-          <w:rtl w:val="false"/>
-        </w:rPr>
-        <w:t xml:space="preserve">Led a team of 5 backend engineers developing a transactional email service. [email-team]</w:t>
-      </w:r>
-    </w:p>
-    <w:p>
-      <w:pPr>
-        <w:pStyle w:val="ListParagraph"/>
-        <w:numPr>
-          <w:ilvl w:val="0"/>
-          <w:numId w:val="1"/>
-        </w:numPr>
-        <w:bidi w:val="false"/>
-        <w:spacing w:after="60" w:before="60"/>
-      </w:pPr>
-      <w:r>
-        <w:rPr>
-          <w:rFonts w:ascii="Aptos" w:cs="Aptos" w:eastAsia="Aptos" w:hAnsi="Aptos"/>
-          <w:color w:val="000000"/>
-          <w:sz w:val="24"/>
-          <w:szCs w:val="24"/>
-          <w:rtl w:val="false"/>
-        </w:rPr>
-        <w:t xml:space="preserve">Scaled the service to around 50 million emails per month. [email-scale]
-Technologies: not separately recorded in the verified claim excerpts</w:t>
+        <w:bidi w:val="false"/>
+        <w:spacing w:after="120" w:before="120" w:line="259.20000000000005"/>
+        <w:jc w:val="left"/>
+      </w:pPr>
+      <w:r>
+        <w:rPr>
+          <w:rFonts w:ascii="Aptos" w:cs="Aptos" w:eastAsia="Aptos" w:hAnsi="Aptos"/>
+          <w:color w:val="000000"/>
+          <w:sz w:val="24"/>
+          <w:szCs w:val="24"/>
+          <w:rtl w:val="false"/>
+        </w:rPr>
+        <w:t xml:space="preserve">MSc in Computer Science, National Technical University, Kharkiv, Ukraine — 2003–2008</w:t>
       </w:r>
     </w:p>
     <w:p>
@@ -965,7 +758,7 @@
         <w:bidi w:val="false"/>
         <w:spacing w:after="120" w:before="240"/>
       </w:pPr>
-      <w:bookmarkStart w:name="_Toc_Education_9" w:id="1"/>
+      <w:bookmarkStart w:name="_Toc_Languages_10" w:id="1"/>
       <w:r>
         <w:rPr>
           <w:rFonts w:ascii="Aptos" w:cs="Aptos" w:eastAsia="Aptos" w:hAnsi="Aptos"/>
@@ -974,7 +767,7 @@
           <w:szCs w:val="28"/>
           <w:rtl w:val="false"/>
         </w:rPr>
-        <w:t xml:space="preserve">Education</w:t>
+        <w:t xml:space="preserve">Languages</w:t>
       </w:r>
       <w:bookmarkEnd w:id="1"/>
     </w:p>
@@ -992,44 +785,28 @@
           <w:szCs w:val="24"/>
           <w:rtl w:val="false"/>
         </w:rPr>
-        <w:t xml:space="preserve">MSc in Computer Science, National Technical University, Kharkiv, Ukraine | 2003 – 2008</w:t>
-      </w:r>
-    </w:p>
-    <w:p>
-      <w:pPr>
-        <w:pStyle w:val="2"/>
-        <w:pStyle w:val="Heading2"/>
-        <w:bidi w:val="false"/>
-        <w:spacing w:after="120" w:before="240"/>
-      </w:pPr>
-      <w:bookmarkStart w:name="_Toc_Languages_10" w:id="1"/>
-      <w:r>
-        <w:rPr>
-          <w:rFonts w:ascii="Aptos" w:cs="Aptos" w:eastAsia="Aptos" w:hAnsi="Aptos"/>
-          <w:color w:val="000000"/>
-          <w:sz w:val="28"/>
-          <w:szCs w:val="28"/>
-          <w:rtl w:val="false"/>
-        </w:rPr>
-        <w:t xml:space="preserve">Languages</w:t>
-      </w:r>
-      <w:bookmarkEnd w:id="1"/>
-    </w:p>
-    <w:p>
-      <w:pPr>
-        <w:bidi w:val="false"/>
-        <w:spacing w:after="120" w:before="120" w:line="259.20000000000005"/>
-        <w:jc w:val="left"/>
-      </w:pPr>
-      <w:r>
-        <w:rPr>
-          <w:rFonts w:ascii="Aptos" w:cs="Aptos" w:eastAsia="Aptos" w:hAnsi="Aptos"/>
-          <w:color w:val="000000"/>
-          <w:sz w:val="24"/>
-          <w:szCs w:val="24"/>
-          <w:rtl w:val="false"/>
-        </w:rPr>
-        <w:t xml:space="preserve">Ukrainian (native) | English (Upper-intermediate)</w:t>
+        <w:t xml:space="preserve">Ukrainian — native</w:t>
+      </w:r>
+      <w:r>
+        <w:rPr>
+          <w:rFonts w:ascii="Aptos" w:cs="Aptos" w:eastAsia="Aptos" w:hAnsi="Aptos"/>
+          <w:color w:val="000000"/>
+          <w:sz w:val="24"/>
+          <w:szCs w:val="24"/>
+          <w:rtl w:val="false"/>
+        </w:rPr>
+        <w:t xml:space="preserve">
+</w:t>
+      </w:r>
+      <w:r>
+        <w:rPr>
+          <w:rFonts w:ascii="Aptos" w:cs="Aptos" w:eastAsia="Aptos" w:hAnsi="Aptos"/>
+          <w:color w:val="000000"/>
+          <w:sz w:val="24"/>
+          <w:szCs w:val="24"/>
+          <w:rtl w:val="false"/>
+        </w:rPr>
+        <w:t xml:space="preserve">English — upper-intermediate</w:t>
       </w:r>
     </w:p>
     <w:sectPr>

</xml_diff>